<commit_message>
Rephrased wording for more transparency
</commit_message>
<xml_diff>
--- a/Usa_Kim_Resume.docx
+++ b/Usa_Kim_Resume.docx
@@ -120,7 +120,7 @@
           <w:sz w:val="20"/>
           <w:szCs w:val="20"/>
         </w:rPr>
-        <w:t xml:space="preserve">IT &amp; Operations Lead  (concurrent with all roles below)</w:t>
+        <w:t>IT &amp; Operations  (concurrent with all roles below)</w:t>
       </w:r>
     </w:p>
     <w:p>
@@ -158,7 +158,7 @@
           <w:sz w:val="20"/>
           <w:szCs w:val="20"/>
         </w:rPr>
-        <w:t xml:space="preserve">Administered and maintained Clover Duo POS, including initial setup, staff training, and ongoing troubleshooting</w:t>
+        <w:t>Administered and maintained Clover Duo POS, including initial setup, onboarding staff, and ongoing troubleshooting</w:t>
       </w:r>
     </w:p>
     <w:p>
@@ -215,26 +215,26 @@
           <w:sz w:val="20"/>
           <w:szCs w:val="20"/>
         </w:rPr>
-        <w:t xml:space="preserve">Oversaw security camera system installation and configuration</w:t>
-      </w:r>
-    </w:p>
-    <w:p>
-      <w:pPr>
-        <w:pStyle w:val="ListParagraph"/>
-        <w:numPr>
-          <w:ilvl w:val="0"/>
-          <w:numId w:val="2"/>
-        </w:numPr>
-        <w:spacing w:after="20" w:before="20"/>
-        <w:ind w:left="720" w:hanging="360"/>
-      </w:pPr>
-      <w:r>
-        <w:rPr>
-          <w:rFonts w:ascii="Arial" w:cs="Arial" w:eastAsia="Arial" w:hAnsi="Arial"/>
-          <w:sz w:val="20"/>
-          <w:szCs w:val="20"/>
-        </w:rPr>
-        <w:t xml:space="preserve">Onboarded and mentored new staff on POS operation and order management workflows</w:t>
+        <w:t>Installed and configured security camera system</w:t>
+      </w:r>
+    </w:p>
+    <w:p>
+      <w:pPr>
+        <w:pStyle w:val="ListParagraph"/>
+        <w:numPr>
+          <w:ilvl w:val="0"/>
+          <w:numId w:val="2"/>
+        </w:numPr>
+        <w:spacing w:after="20" w:before="20"/>
+        <w:ind w:left="720" w:hanging="360"/>
+      </w:pPr>
+      <w:r>
+        <w:rPr>
+          <w:rFonts w:ascii="Arial" w:cs="Arial" w:eastAsia="Arial" w:hAnsi="Arial"/>
+          <w:sz w:val="20"/>
+          <w:szCs w:val="20"/>
+        </w:rPr>
+        <w:t>Onboarded and trained new staff on POS operation and order management workflows</w:t>
       </w:r>
     </w:p>
     <w:p>
@@ -331,26 +331,26 @@
           <w:sz w:val="20"/>
           <w:szCs w:val="20"/>
         </w:rPr>
-        <w:t xml:space="preserve">Maintained and optimized POS systems and back-office computers, reducing ticket processing times</w:t>
-      </w:r>
-    </w:p>
-    <w:p>
-      <w:pPr>
-        <w:pStyle w:val="ListParagraph"/>
-        <w:numPr>
-          <w:ilvl w:val="0"/>
-          <w:numId w:val="2"/>
-        </w:numPr>
-        <w:spacing w:after="20" w:before="20"/>
-        <w:ind w:left="720" w:hanging="360"/>
-      </w:pPr>
-      <w:r>
-        <w:rPr>
-          <w:rFonts w:ascii="Arial" w:cs="Arial" w:eastAsia="Arial" w:hAnsi="Arial"/>
-          <w:sz w:val="20"/>
-          <w:szCs w:val="20"/>
-        </w:rPr>
-        <w:t xml:space="preserve">Served as informal IT lead — troubleshot hardware/software issues for staff at first point of contact</w:t>
+        <w:t>Repaired and maintained POS hardware and peripherals, reducing ticket processing delays</w:t>
+      </w:r>
+    </w:p>
+    <w:p>
+      <w:pPr>
+        <w:pStyle w:val="ListParagraph"/>
+        <w:numPr>
+          <w:ilvl w:val="0"/>
+          <w:numId w:val="2"/>
+        </w:numPr>
+        <w:spacing w:after="20" w:before="20"/>
+        <w:ind w:left="720" w:hanging="360"/>
+      </w:pPr>
+      <w:r>
+        <w:rPr>
+          <w:rFonts w:ascii="Arial" w:cs="Arial" w:eastAsia="Arial" w:hAnsi="Arial"/>
+          <w:sz w:val="20"/>
+          <w:szCs w:val="20"/>
+        </w:rPr>
+        <w:t>Served as the sole technical resource — troubleshot hardware/software issues for staff at first point of contact</w:t>
       </w:r>
     </w:p>
     <w:p>
@@ -580,7 +580,7 @@
           <w:sz w:val="20"/>
           <w:szCs w:val="20"/>
         </w:rPr>
-        <w:t xml:space="preserve">Proposed and implemented an Apple ecosystem workflow that increased team productivity and listing speed</w:t>
+        <w:t>Proposed and implemented an Apple ecosystem workflow for the listing team</w:t>
       </w:r>
     </w:p>
     <w:p>
@@ -792,7 +792,7 @@
           <w:sz w:val="20"/>
           <w:szCs w:val="20"/>
         </w:rPr>
-        <w:t xml:space="preserve">Implemented UI and playback controls, integrating with the Lyrion JSON-RPC API for library browsing and queue management</w:t>
+        <w:t>Designing UI and playback controls to integrate with the Lyrion JSON-RPC API for library browsing and queue management</w:t>
       </w:r>
     </w:p>
     <w:p>
@@ -953,7 +953,7 @@
           <w:sz w:val="20"/>
           <w:szCs w:val="20"/>
         </w:rPr>
-        <w:t xml:space="preserve">Python, C++, Java, JavaScript, HTML/CSS, SQL, Bash / Shell Scripting</w:t>
+        <w:t>Python, C#, WinUI3, C++, Java, JavaScript, HTML/CSS, SQL, Bash / Shell Scripting</w:t>
       </w:r>
     </w:p>
     <w:p>

</xml_diff>

<commit_message>
Resume: homelab bullets rewritten from the live inventory
32 containers / 11 compose stacks measured on the host, plus the no-forwarded-
ports design (Cloudflare Tunnel + Tailscale) and the shared WireGuard namespace.
Drops a duplicated stack bullet and WinUI 3 to hold one page.
</commit_message>
<xml_diff>
--- a/Usa_Kim_Resume.docx
+++ b/Usa_Kim_Resume.docx
@@ -471,25 +471,25 @@
           <w:sz w:val="20"/>
           <w:szCs w:val="20"/>
         </w:rPr>
-        <w:t xml:space="preserve">Designed and deployed a full self-hosted stack on a UGREEN NAS using Docker and Portainer: Jellyfin, Sonarr/Radarr/Lidarr, Gluetun/ProtonVPN, Uptime Kuma, VaultWarden, and Tailscale</w:t>
-      </w:r>
-    </w:p>
-    <w:p>
-      <w:pPr>
-        <w:pStyle w:val="ListParagraph"/>
-        <w:numPr>
-          <w:ilvl w:val="0"/>
-          <w:numId w:val="2"/>
-        </w:numPr>
-        <w:spacing w:after="20"/>
-      </w:pPr>
-      <w:r>
-        <w:rPr>
-          <w:rFonts w:ascii="Calibri" w:cs="Calibri" w:eastAsia="Calibri" w:hAnsi="Calibri"/>
-          <w:sz w:val="20"/>
-          <w:szCs w:val="20"/>
-        </w:rPr>
-        <w:t>Resolved NAT loopback, reverse proxy conflicts, and host-networking edge cases to get automated media acquisition pipelines running with custom quality profiles and VPN-integrated download clients</w:t>
+        <w:t>Run a 32-container homelab on a UGREEN NAS (Debian 12): 11 Docker Compose stacks under Portainer — media, photos with local ML search, self-hosted mail, password management, monitoring.</w:t>
+      </w:r>
+    </w:p>
+    <w:p>
+      <w:pPr>
+        <w:pStyle w:val="ListParagraph"/>
+        <w:numPr>
+          <w:ilvl w:val="0"/>
+          <w:numId w:val="2"/>
+        </w:numPr>
+        <w:spacing w:after="20"/>
+      </w:pPr>
+      <w:r>
+        <w:rPr>
+          <w:rFonts w:ascii="Calibri" w:cs="Calibri" w:eastAsia="Calibri" w:hAnsi="Calibri"/>
+          <w:sz w:val="20"/>
+          <w:szCs w:val="20"/>
+        </w:rPr>
+        <w:t>No forwarded ports: public traffic via a Cloudflare Tunnel, private via Tailscale. Eight download services share one WireGuard namespace, so they lose the network if the VPN drops — after working through NAT loopback and reverse proxy conflicts.</w:t>
       </w:r>
     </w:p>
     <w:p>
@@ -538,24 +538,6 @@
           <w:szCs w:val="20"/>
         </w:rPr>
         <w:t>Self-Hosted Service Stack &amp; Training-Data Pipeline</w:t>
-      </w:r>
-    </w:p>
-    <w:p>
-      <w:pPr>
-        <w:pStyle w:val="ListParagraph"/>
-        <w:numPr>
-          <w:ilvl w:val="0"/>
-          <w:numId w:val="2"/>
-        </w:numPr>
-        <w:spacing w:after="20"/>
-      </w:pPr>
-      <w:r>
-        <w:rPr>
-          <w:rFonts w:ascii="Calibri" w:cs="Calibri" w:eastAsia="Calibri" w:hAnsi="Calibri"/>
-          <w:sz w:val="20"/>
-          <w:szCs w:val="20"/>
-        </w:rPr>
-        <w:t>Run a multi-service Docker Compose deployment — FastAPI, ChromaDB, SearXNG, ntfy, Cloudflare tunnel — over Tailscale; contributed media ingest, transcription, and UI fixes to the open-source project</w:t>
       </w:r>
     </w:p>
     <w:p>
@@ -732,7 +714,7 @@
           <w:sz w:val="20"/>
           <w:szCs w:val="20"/>
         </w:rPr>
-        <w:t>Python, C#, WinUI 3, C++, Java, JavaScript, HTML/CSS, SQL, Bash / Shell Scripting, FastAPI, REST APIs, ffmpeg</w:t>
+        <w:t xml:space="preserve"> Python, C#, C++, Java, JavaScript, HTML/CSS, SQL, Bash / Shell, FastAPI, REST APIs, ffmpeg</w:t>
       </w:r>
     </w:p>
     <w:sectPr>

</xml_diff>